<commit_message>
Refonte du front : page d'accueil, nouvelle carte et design system
- Page d'accueil (/) avec héros, aperçu de l'application, chiffres en direct,
  grille bento et appel à l'action ; l'application passe sur /app.
- Carte : fond CARTO Positron avec repli OpenStreetMap, zones de quartier
  organiques colorées par ICV, pastilles interactives, fiche explicative par
  quartier, couleurs centralisées (lib/couleurs.ts).
- Design system Cadre+ (Sleek + Bento + Enterprise) : jetons Tailwind,
  composants, panneaux flottants, assistant IA en bouton flottant.
- Éditeur manuel, investissements et assistant IA (modes auto / mixte / manuel,
  avis de l'IA), mode d'emploi et aide contextuelle.
- Backend : CORS configurable, limitation de débit des appels IA, render.yaml.
- Cahier des charges Word régénéré, tests e2e étendus (13) et tests API (40).

Co-Authored-By: Claude Sonnet 5.5 <noreply@anthropic.com>
</commit_message>
<xml_diff>
--- a/docs/Cahier-des-charges-Cadre-plus.docx
+++ b/docs/Cahier-des-charges-Cadre-plus.docx
@@ -167,7 +167,7 @@
     <w:sdt>
       <w:sdtPr>
         <w:alias w:val="Sommaire"/>
-        <w:id w:val="-1479210330"/>
+        <w:id w:val="-1027633171"/>
       </w:sdtPr>
       <w:sdtEndPr/>
       <w:sdtContent>
@@ -196,7 +196,7 @@
           <w:r>
             <w:fldChar w:fldCharType="separate"/>
           </w:r>
-          <w:hyperlink w:anchor="_Toc243815578" w:history="1">
+          <w:hyperlink w:anchor="_Toc243819269" w:history="1">
             <w:r>
               <w:rPr>
                 <w:rStyle w:val="Lienhypertexte"/>
@@ -220,7 +220,7 @@
               <w:rPr>
                 <w:noProof/>
               </w:rPr>
-              <w:instrText xml:space="preserve"> PAGEREF _Toc243815578 \h </w:instrText>
+              <w:instrText xml:space="preserve"> PAGEREF _Toc243819269 \h </w:instrText>
             </w:r>
             <w:r>
               <w:rPr>
@@ -263,7 +263,7 @@
               <w14:ligatures w14:val="standardContextual"/>
             </w:rPr>
           </w:pPr>
-          <w:hyperlink w:anchor="_Toc243815579" w:history="1">
+          <w:hyperlink w:anchor="_Toc243819270" w:history="1">
             <w:r>
               <w:rPr>
                 <w:rStyle w:val="Lienhypertexte"/>
@@ -287,7 +287,7 @@
               <w:rPr>
                 <w:noProof/>
               </w:rPr>
-              <w:instrText xml:space="preserve"> PAGEREF _Toc243815579 \h </w:instrText>
+              <w:instrText xml:space="preserve"> PAGEREF _Toc243819270 \h </w:instrText>
             </w:r>
             <w:r>
               <w:rPr>
@@ -330,7 +330,7 @@
               <w14:ligatures w14:val="standardContextual"/>
             </w:rPr>
           </w:pPr>
-          <w:hyperlink w:anchor="_Toc243815580" w:history="1">
+          <w:hyperlink w:anchor="_Toc243819271" w:history="1">
             <w:r>
               <w:rPr>
                 <w:rStyle w:val="Lienhypertexte"/>
@@ -354,7 +354,7 @@
               <w:rPr>
                 <w:noProof/>
               </w:rPr>
-              <w:instrText xml:space="preserve"> PAGEREF _Toc243815580 \h </w:instrText>
+              <w:instrText xml:space="preserve"> PAGEREF _Toc243819271 \h </w:instrText>
             </w:r>
             <w:r>
               <w:rPr>
@@ -397,7 +397,7 @@
               <w14:ligatures w14:val="standardContextual"/>
             </w:rPr>
           </w:pPr>
-          <w:hyperlink w:anchor="_Toc243815581" w:history="1">
+          <w:hyperlink w:anchor="_Toc243819272" w:history="1">
             <w:r>
               <w:rPr>
                 <w:rStyle w:val="Lienhypertexte"/>
@@ -421,7 +421,7 @@
               <w:rPr>
                 <w:noProof/>
               </w:rPr>
-              <w:instrText xml:space="preserve"> PAGEREF _Toc243815581 \h </w:instrText>
+              <w:instrText xml:space="preserve"> PAGEREF _Toc243819272 \h </w:instrText>
             </w:r>
             <w:r>
               <w:rPr>
@@ -464,7 +464,7 @@
               <w14:ligatures w14:val="standardContextual"/>
             </w:rPr>
           </w:pPr>
-          <w:hyperlink w:anchor="_Toc243815582" w:history="1">
+          <w:hyperlink w:anchor="_Toc243819273" w:history="1">
             <w:r>
               <w:rPr>
                 <w:rStyle w:val="Lienhypertexte"/>
@@ -488,7 +488,7 @@
               <w:rPr>
                 <w:noProof/>
               </w:rPr>
-              <w:instrText xml:space="preserve"> PAGEREF _Toc243815582 \h </w:instrText>
+              <w:instrText xml:space="preserve"> PAGEREF _Toc243819273 \h </w:instrText>
             </w:r>
             <w:r>
               <w:rPr>
@@ -531,7 +531,7 @@
               <w14:ligatures w14:val="standardContextual"/>
             </w:rPr>
           </w:pPr>
-          <w:hyperlink w:anchor="_Toc243815583" w:history="1">
+          <w:hyperlink w:anchor="_Toc243819274" w:history="1">
             <w:r>
               <w:rPr>
                 <w:rStyle w:val="Lienhypertexte"/>
@@ -555,7 +555,7 @@
               <w:rPr>
                 <w:noProof/>
               </w:rPr>
-              <w:instrText xml:space="preserve"> PAGEREF _Toc243815583 \h </w:instrText>
+              <w:instrText xml:space="preserve"> PAGEREF _Toc243819274 \h </w:instrText>
             </w:r>
             <w:r>
               <w:rPr>
@@ -598,7 +598,7 @@
               <w14:ligatures w14:val="standardContextual"/>
             </w:rPr>
           </w:pPr>
-          <w:hyperlink w:anchor="_Toc243815584" w:history="1">
+          <w:hyperlink w:anchor="_Toc243819275" w:history="1">
             <w:r>
               <w:rPr>
                 <w:rStyle w:val="Lienhypertexte"/>
@@ -622,7 +622,7 @@
               <w:rPr>
                 <w:noProof/>
               </w:rPr>
-              <w:instrText xml:space="preserve"> PAGEREF _Toc243815584 \h </w:instrText>
+              <w:instrText xml:space="preserve"> PAGEREF _Toc243819275 \h </w:instrText>
             </w:r>
             <w:r>
               <w:rPr>
@@ -665,7 +665,7 @@
               <w14:ligatures w14:val="standardContextual"/>
             </w:rPr>
           </w:pPr>
-          <w:hyperlink w:anchor="_Toc243815585" w:history="1">
+          <w:hyperlink w:anchor="_Toc243819276" w:history="1">
             <w:r>
               <w:rPr>
                 <w:rStyle w:val="Lienhypertexte"/>
@@ -689,7 +689,7 @@
               <w:rPr>
                 <w:noProof/>
               </w:rPr>
-              <w:instrText xml:space="preserve"> PAGEREF _Toc243815585 \h </w:instrText>
+              <w:instrText xml:space="preserve"> PAGEREF _Toc243819276 \h </w:instrText>
             </w:r>
             <w:r>
               <w:rPr>
@@ -732,7 +732,7 @@
               <w14:ligatures w14:val="standardContextual"/>
             </w:rPr>
           </w:pPr>
-          <w:hyperlink w:anchor="_Toc243815586" w:history="1">
+          <w:hyperlink w:anchor="_Toc243819277" w:history="1">
             <w:r>
               <w:rPr>
                 <w:rStyle w:val="Lienhypertexte"/>
@@ -756,7 +756,7 @@
               <w:rPr>
                 <w:noProof/>
               </w:rPr>
-              <w:instrText xml:space="preserve"> PAGEREF _Toc243815586 \h </w:instrText>
+              <w:instrText xml:space="preserve"> PAGEREF _Toc243819277 \h </w:instrText>
             </w:r>
             <w:r>
               <w:rPr>
@@ -799,7 +799,7 @@
               <w14:ligatures w14:val="standardContextual"/>
             </w:rPr>
           </w:pPr>
-          <w:hyperlink w:anchor="_Toc243815587" w:history="1">
+          <w:hyperlink w:anchor="_Toc243819278" w:history="1">
             <w:r>
               <w:rPr>
                 <w:rStyle w:val="Lienhypertexte"/>
@@ -823,7 +823,7 @@
               <w:rPr>
                 <w:noProof/>
               </w:rPr>
-              <w:instrText xml:space="preserve"> PAGEREF _Toc243815587 \h </w:instrText>
+              <w:instrText xml:space="preserve"> PAGEREF _Toc243819278 \h </w:instrText>
             </w:r>
             <w:r>
               <w:rPr>
@@ -866,7 +866,7 @@
               <w14:ligatures w14:val="standardContextual"/>
             </w:rPr>
           </w:pPr>
-          <w:hyperlink w:anchor="_Toc243815588" w:history="1">
+          <w:hyperlink w:anchor="_Toc243819279" w:history="1">
             <w:r>
               <w:rPr>
                 <w:rStyle w:val="Lienhypertexte"/>
@@ -890,7 +890,7 @@
               <w:rPr>
                 <w:noProof/>
               </w:rPr>
-              <w:instrText xml:space="preserve"> PAGEREF _Toc243815588 \h </w:instrText>
+              <w:instrText xml:space="preserve"> PAGEREF _Toc243819279 \h </w:instrText>
             </w:r>
             <w:r>
               <w:rPr>
@@ -933,7 +933,7 @@
               <w14:ligatures w14:val="standardContextual"/>
             </w:rPr>
           </w:pPr>
-          <w:hyperlink w:anchor="_Toc243815589" w:history="1">
+          <w:hyperlink w:anchor="_Toc243819280" w:history="1">
             <w:r>
               <w:rPr>
                 <w:rStyle w:val="Lienhypertexte"/>
@@ -957,7 +957,7 @@
               <w:rPr>
                 <w:noProof/>
               </w:rPr>
-              <w:instrText xml:space="preserve"> PAGEREF _Toc243815589 \h </w:instrText>
+              <w:instrText xml:space="preserve"> PAGEREF _Toc243819280 \h </w:instrText>
             </w:r>
             <w:r>
               <w:rPr>
@@ -1000,7 +1000,7 @@
               <w14:ligatures w14:val="standardContextual"/>
             </w:rPr>
           </w:pPr>
-          <w:hyperlink w:anchor="_Toc243815590" w:history="1">
+          <w:hyperlink w:anchor="_Toc243819281" w:history="1">
             <w:r>
               <w:rPr>
                 <w:rStyle w:val="Lienhypertexte"/>
@@ -1024,7 +1024,7 @@
               <w:rPr>
                 <w:noProof/>
               </w:rPr>
-              <w:instrText xml:space="preserve"> PAGEREF _Toc243815590 \h </w:instrText>
+              <w:instrText xml:space="preserve"> PAGEREF _Toc243819281 \h </w:instrText>
             </w:r>
             <w:r>
               <w:rPr>
@@ -1067,7 +1067,7 @@
               <w14:ligatures w14:val="standardContextual"/>
             </w:rPr>
           </w:pPr>
-          <w:hyperlink w:anchor="_Toc243815591" w:history="1">
+          <w:hyperlink w:anchor="_Toc243819282" w:history="1">
             <w:r>
               <w:rPr>
                 <w:rStyle w:val="Lienhypertexte"/>
@@ -1091,7 +1091,7 @@
               <w:rPr>
                 <w:noProof/>
               </w:rPr>
-              <w:instrText xml:space="preserve"> PAGEREF _Toc243815591 \h </w:instrText>
+              <w:instrText xml:space="preserve"> PAGEREF _Toc243819282 \h </w:instrText>
             </w:r>
             <w:r>
               <w:rPr>
@@ -1134,7 +1134,7 @@
               <w14:ligatures w14:val="standardContextual"/>
             </w:rPr>
           </w:pPr>
-          <w:hyperlink w:anchor="_Toc243815592" w:history="1">
+          <w:hyperlink w:anchor="_Toc243819283" w:history="1">
             <w:r>
               <w:rPr>
                 <w:rStyle w:val="Lienhypertexte"/>
@@ -1158,7 +1158,7 @@
               <w:rPr>
                 <w:noProof/>
               </w:rPr>
-              <w:instrText xml:space="preserve"> PAGEREF _Toc243815592 \h </w:instrText>
+              <w:instrText xml:space="preserve"> PAGEREF _Toc243819283 \h </w:instrText>
             </w:r>
             <w:r>
               <w:rPr>
@@ -1201,7 +1201,7 @@
               <w14:ligatures w14:val="standardContextual"/>
             </w:rPr>
           </w:pPr>
-          <w:hyperlink w:anchor="_Toc243815593" w:history="1">
+          <w:hyperlink w:anchor="_Toc243819284" w:history="1">
             <w:r>
               <w:rPr>
                 <w:rStyle w:val="Lienhypertexte"/>
@@ -1225,7 +1225,7 @@
               <w:rPr>
                 <w:noProof/>
               </w:rPr>
-              <w:instrText xml:space="preserve"> PAGEREF _Toc243815593 \h </w:instrText>
+              <w:instrText xml:space="preserve"> PAGEREF _Toc243819284 \h </w:instrText>
             </w:r>
             <w:r>
               <w:rPr>
@@ -1268,7 +1268,7 @@
               <w14:ligatures w14:val="standardContextual"/>
             </w:rPr>
           </w:pPr>
-          <w:hyperlink w:anchor="_Toc243815594" w:history="1">
+          <w:hyperlink w:anchor="_Toc243819285" w:history="1">
             <w:r>
               <w:rPr>
                 <w:rStyle w:val="Lienhypertexte"/>
@@ -1292,7 +1292,7 @@
               <w:rPr>
                 <w:noProof/>
               </w:rPr>
-              <w:instrText xml:space="preserve"> PAGEREF _Toc243815594 \h </w:instrText>
+              <w:instrText xml:space="preserve"> PAGEREF _Toc243819285 \h </w:instrText>
             </w:r>
             <w:r>
               <w:rPr>
@@ -1335,7 +1335,7 @@
               <w14:ligatures w14:val="standardContextual"/>
             </w:rPr>
           </w:pPr>
-          <w:hyperlink w:anchor="_Toc243815595" w:history="1">
+          <w:hyperlink w:anchor="_Toc243819286" w:history="1">
             <w:r>
               <w:rPr>
                 <w:rStyle w:val="Lienhypertexte"/>
@@ -1359,7 +1359,7 @@
               <w:rPr>
                 <w:noProof/>
               </w:rPr>
-              <w:instrText xml:space="preserve"> PAGEREF _Toc243815595 \h </w:instrText>
+              <w:instrText xml:space="preserve"> PAGEREF _Toc243819286 \h </w:instrText>
             </w:r>
             <w:r>
               <w:rPr>
@@ -1402,7 +1402,7 @@
               <w14:ligatures w14:val="standardContextual"/>
             </w:rPr>
           </w:pPr>
-          <w:hyperlink w:anchor="_Toc243815596" w:history="1">
+          <w:hyperlink w:anchor="_Toc243819287" w:history="1">
             <w:r>
               <w:rPr>
                 <w:rStyle w:val="Lienhypertexte"/>
@@ -1426,7 +1426,7 @@
               <w:rPr>
                 <w:noProof/>
               </w:rPr>
-              <w:instrText xml:space="preserve"> PAGEREF _Toc243815596 \h </w:instrText>
+              <w:instrText xml:space="preserve"> PAGEREF _Toc243819287 \h </w:instrText>
             </w:r>
             <w:r>
               <w:rPr>
@@ -1469,7 +1469,7 @@
               <w14:ligatures w14:val="standardContextual"/>
             </w:rPr>
           </w:pPr>
-          <w:hyperlink w:anchor="_Toc243815597" w:history="1">
+          <w:hyperlink w:anchor="_Toc243819288" w:history="1">
             <w:r>
               <w:rPr>
                 <w:rStyle w:val="Lienhypertexte"/>
@@ -1493,7 +1493,7 @@
               <w:rPr>
                 <w:noProof/>
               </w:rPr>
-              <w:instrText xml:space="preserve"> PAGEREF _Toc243815597 \h </w:instrText>
+              <w:instrText xml:space="preserve"> PAGEREF _Toc243819288 \h </w:instrText>
             </w:r>
             <w:r>
               <w:rPr>
@@ -1536,7 +1536,7 @@
               <w14:ligatures w14:val="standardContextual"/>
             </w:rPr>
           </w:pPr>
-          <w:hyperlink w:anchor="_Toc243815598" w:history="1">
+          <w:hyperlink w:anchor="_Toc243819289" w:history="1">
             <w:r>
               <w:rPr>
                 <w:rStyle w:val="Lienhypertexte"/>
@@ -1560,7 +1560,7 @@
               <w:rPr>
                 <w:noProof/>
               </w:rPr>
-              <w:instrText xml:space="preserve"> PAGEREF _Toc243815598 \h </w:instrText>
+              <w:instrText xml:space="preserve"> PAGEREF _Toc243819289 \h </w:instrText>
             </w:r>
             <w:r>
               <w:rPr>
@@ -1603,7 +1603,7 @@
               <w14:ligatures w14:val="standardContextual"/>
             </w:rPr>
           </w:pPr>
-          <w:hyperlink w:anchor="_Toc243815599" w:history="1">
+          <w:hyperlink w:anchor="_Toc243819290" w:history="1">
             <w:r>
               <w:rPr>
                 <w:rStyle w:val="Lienhypertexte"/>
@@ -1627,7 +1627,7 @@
               <w:rPr>
                 <w:noProof/>
               </w:rPr>
-              <w:instrText xml:space="preserve"> PAGEREF _Toc243815599 \h </w:instrText>
+              <w:instrText xml:space="preserve"> PAGEREF _Toc243819290 \h </w:instrText>
             </w:r>
             <w:r>
               <w:rPr>
@@ -1670,7 +1670,7 @@
               <w14:ligatures w14:val="standardContextual"/>
             </w:rPr>
           </w:pPr>
-          <w:hyperlink w:anchor="_Toc243815600" w:history="1">
+          <w:hyperlink w:anchor="_Toc243819291" w:history="1">
             <w:r>
               <w:rPr>
                 <w:rStyle w:val="Lienhypertexte"/>
@@ -1694,7 +1694,7 @@
               <w:rPr>
                 <w:noProof/>
               </w:rPr>
-              <w:instrText xml:space="preserve"> PAGEREF _Toc243815600 \h </w:instrText>
+              <w:instrText xml:space="preserve"> PAGEREF _Toc243819291 \h </w:instrText>
             </w:r>
             <w:r>
               <w:rPr>
@@ -1737,7 +1737,7 @@
               <w14:ligatures w14:val="standardContextual"/>
             </w:rPr>
           </w:pPr>
-          <w:hyperlink w:anchor="_Toc243815601" w:history="1">
+          <w:hyperlink w:anchor="_Toc243819292" w:history="1">
             <w:r>
               <w:rPr>
                 <w:rStyle w:val="Lienhypertexte"/>
@@ -1761,7 +1761,7 @@
               <w:rPr>
                 <w:noProof/>
               </w:rPr>
-              <w:instrText xml:space="preserve"> PAGEREF _Toc243815601 \h </w:instrText>
+              <w:instrText xml:space="preserve"> PAGEREF _Toc243819292 \h </w:instrText>
             </w:r>
             <w:r>
               <w:rPr>
@@ -1804,7 +1804,7 @@
               <w14:ligatures w14:val="standardContextual"/>
             </w:rPr>
           </w:pPr>
-          <w:hyperlink w:anchor="_Toc243815602" w:history="1">
+          <w:hyperlink w:anchor="_Toc243819293" w:history="1">
             <w:r>
               <w:rPr>
                 <w:rStyle w:val="Lienhypertexte"/>
@@ -1835,7 +1835,7 @@
                 <w:noProof/>
               </w:rPr>
               <w:lastRenderedPageBreak/>
-              <w:instrText xml:space="preserve">_Toc243815602 \h </w:instrText>
+              <w:instrText xml:space="preserve">_Toc243819293 \h </w:instrText>
             </w:r>
             <w:r>
               <w:rPr>
@@ -1878,7 +1878,7 @@
               <w14:ligatures w14:val="standardContextual"/>
             </w:rPr>
           </w:pPr>
-          <w:hyperlink w:anchor="_Toc243815603" w:history="1">
+          <w:hyperlink w:anchor="_Toc243819294" w:history="1">
             <w:r>
               <w:rPr>
                 <w:rStyle w:val="Lienhypertexte"/>
@@ -1902,7 +1902,7 @@
               <w:rPr>
                 <w:noProof/>
               </w:rPr>
-              <w:instrText xml:space="preserve"> PAGEREF _Toc243815603 \h </w:instrText>
+              <w:instrText xml:space="preserve"> PAGEREF _Toc243819294 \h </w:instrText>
             </w:r>
             <w:r>
               <w:rPr>
@@ -1945,7 +1945,7 @@
               <w14:ligatures w14:val="standardContextual"/>
             </w:rPr>
           </w:pPr>
-          <w:hyperlink w:anchor="_Toc243815604" w:history="1">
+          <w:hyperlink w:anchor="_Toc243819295" w:history="1">
             <w:r>
               <w:rPr>
                 <w:rStyle w:val="Lienhypertexte"/>
@@ -1969,7 +1969,7 @@
               <w:rPr>
                 <w:noProof/>
               </w:rPr>
-              <w:instrText xml:space="preserve"> PAGEREF _Toc243815604 \h </w:instrText>
+              <w:instrText xml:space="preserve"> PAGEREF _Toc243819295 \h </w:instrText>
             </w:r>
             <w:r>
               <w:rPr>
@@ -2012,7 +2012,7 @@
               <w14:ligatures w14:val="standardContextual"/>
             </w:rPr>
           </w:pPr>
-          <w:hyperlink w:anchor="_Toc243815605" w:history="1">
+          <w:hyperlink w:anchor="_Toc243819296" w:history="1">
             <w:r>
               <w:rPr>
                 <w:rStyle w:val="Lienhypertexte"/>
@@ -2036,7 +2036,7 @@
               <w:rPr>
                 <w:noProof/>
               </w:rPr>
-              <w:instrText xml:space="preserve"> PAGEREF _Toc243815605 \h </w:instrText>
+              <w:instrText xml:space="preserve"> PAGEREF _Toc243819296 \h </w:instrText>
             </w:r>
             <w:r>
               <w:rPr>
@@ -2079,7 +2079,7 @@
               <w14:ligatures w14:val="standardContextual"/>
             </w:rPr>
           </w:pPr>
-          <w:hyperlink w:anchor="_Toc243815606" w:history="1">
+          <w:hyperlink w:anchor="_Toc243819297" w:history="1">
             <w:r>
               <w:rPr>
                 <w:rStyle w:val="Lienhypertexte"/>
@@ -2103,7 +2103,7 @@
               <w:rPr>
                 <w:noProof/>
               </w:rPr>
-              <w:instrText xml:space="preserve"> PAGEREF _Toc243815606 \h </w:instrText>
+              <w:instrText xml:space="preserve"> PAGEREF _Toc243819297 \h </w:instrText>
             </w:r>
             <w:r>
               <w:rPr>
@@ -2146,7 +2146,7 @@
               <w14:ligatures w14:val="standardContextual"/>
             </w:rPr>
           </w:pPr>
-          <w:hyperlink w:anchor="_Toc243815607" w:history="1">
+          <w:hyperlink w:anchor="_Toc243819298" w:history="1">
             <w:r>
               <w:rPr>
                 <w:rStyle w:val="Lienhypertexte"/>
@@ -2170,7 +2170,7 @@
               <w:rPr>
                 <w:noProof/>
               </w:rPr>
-              <w:instrText xml:space="preserve"> PAGEREF _Toc243815607 \h </w:instrText>
+              <w:instrText xml:space="preserve"> PAGEREF _Toc243819298 \h </w:instrText>
             </w:r>
             <w:r>
               <w:rPr>
@@ -2213,7 +2213,7 @@
               <w14:ligatures w14:val="standardContextual"/>
             </w:rPr>
           </w:pPr>
-          <w:hyperlink w:anchor="_Toc243815608" w:history="1">
+          <w:hyperlink w:anchor="_Toc243819299" w:history="1">
             <w:r>
               <w:rPr>
                 <w:rStyle w:val="Lienhypertexte"/>
@@ -2237,7 +2237,7 @@
               <w:rPr>
                 <w:noProof/>
               </w:rPr>
-              <w:instrText xml:space="preserve"> PAGEREF _Toc243815608 \h </w:instrText>
+              <w:instrText xml:space="preserve"> PAGEREF _Toc243819299 \h </w:instrText>
             </w:r>
             <w:r>
               <w:rPr>
@@ -2280,7 +2280,7 @@
               <w14:ligatures w14:val="standardContextual"/>
             </w:rPr>
           </w:pPr>
-          <w:hyperlink w:anchor="_Toc243815609" w:history="1">
+          <w:hyperlink w:anchor="_Toc243819300" w:history="1">
             <w:r>
               <w:rPr>
                 <w:rStyle w:val="Lienhypertexte"/>
@@ -2304,7 +2304,7 @@
               <w:rPr>
                 <w:noProof/>
               </w:rPr>
-              <w:instrText xml:space="preserve"> PAGEREF _Toc243815609 \h </w:instrText>
+              <w:instrText xml:space="preserve"> PAGEREF _Toc243819300 \h </w:instrText>
             </w:r>
             <w:r>
               <w:rPr>
@@ -2347,7 +2347,7 @@
               <w14:ligatures w14:val="standardContextual"/>
             </w:rPr>
           </w:pPr>
-          <w:hyperlink w:anchor="_Toc243815610" w:history="1">
+          <w:hyperlink w:anchor="_Toc243819301" w:history="1">
             <w:r>
               <w:rPr>
                 <w:rStyle w:val="Lienhypertexte"/>
@@ -2371,7 +2371,7 @@
               <w:rPr>
                 <w:noProof/>
               </w:rPr>
-              <w:instrText xml:space="preserve"> PAGEREF _Toc243815610 \h </w:instrText>
+              <w:instrText xml:space="preserve"> PAGEREF _Toc243819301 \h </w:instrText>
             </w:r>
             <w:r>
               <w:rPr>
@@ -2414,7 +2414,7 @@
               <w14:ligatures w14:val="standardContextual"/>
             </w:rPr>
           </w:pPr>
-          <w:hyperlink w:anchor="_Toc243815611" w:history="1">
+          <w:hyperlink w:anchor="_Toc243819302" w:history="1">
             <w:r>
               <w:rPr>
                 <w:rStyle w:val="Lienhypertexte"/>
@@ -2438,7 +2438,7 @@
               <w:rPr>
                 <w:noProof/>
               </w:rPr>
-              <w:instrText xml:space="preserve"> PAGEREF _Toc243815611 \h </w:instrText>
+              <w:instrText xml:space="preserve"> PAGEREF _Toc243819302 \h </w:instrText>
             </w:r>
             <w:r>
               <w:rPr>
@@ -2481,7 +2481,7 @@
               <w14:ligatures w14:val="standardContextual"/>
             </w:rPr>
           </w:pPr>
-          <w:hyperlink w:anchor="_Toc243815612" w:history="1">
+          <w:hyperlink w:anchor="_Toc243819303" w:history="1">
             <w:r>
               <w:rPr>
                 <w:rStyle w:val="Lienhypertexte"/>
@@ -2505,7 +2505,7 @@
               <w:rPr>
                 <w:noProof/>
               </w:rPr>
-              <w:instrText xml:space="preserve"> PAGEREF _Toc243815612 \h </w:instrText>
+              <w:instrText xml:space="preserve"> PAGEREF _Toc243819303 \h </w:instrText>
             </w:r>
             <w:r>
               <w:rPr>
@@ -2548,7 +2548,7 @@
               <w14:ligatures w14:val="standardContextual"/>
             </w:rPr>
           </w:pPr>
-          <w:hyperlink w:anchor="_Toc243815613" w:history="1">
+          <w:hyperlink w:anchor="_Toc243819304" w:history="1">
             <w:r>
               <w:rPr>
                 <w:rStyle w:val="Lienhypertexte"/>
@@ -2572,7 +2572,7 @@
               <w:rPr>
                 <w:noProof/>
               </w:rPr>
-              <w:instrText xml:space="preserve"> PAGEREF _Toc243815613 \h </w:instrText>
+              <w:instrText xml:space="preserve"> PAGEREF _Toc243819304 \h </w:instrText>
             </w:r>
             <w:r>
               <w:rPr>
@@ -2615,7 +2615,7 @@
               <w14:ligatures w14:val="standardContextual"/>
             </w:rPr>
           </w:pPr>
-          <w:hyperlink w:anchor="_Toc243815614" w:history="1">
+          <w:hyperlink w:anchor="_Toc243819305" w:history="1">
             <w:r>
               <w:rPr>
                 <w:rStyle w:val="Lienhypertexte"/>
@@ -2639,7 +2639,7 @@
               <w:rPr>
                 <w:noProof/>
               </w:rPr>
-              <w:instrText xml:space="preserve"> PAGEREF _Toc243815614 \h </w:instrText>
+              <w:instrText xml:space="preserve"> PAGEREF _Toc243819305 \h </w:instrText>
             </w:r>
             <w:r>
               <w:rPr>
@@ -2682,7 +2682,7 @@
               <w14:ligatures w14:val="standardContextual"/>
             </w:rPr>
           </w:pPr>
-          <w:hyperlink w:anchor="_Toc243815615" w:history="1">
+          <w:hyperlink w:anchor="_Toc243819306" w:history="1">
             <w:r>
               <w:rPr>
                 <w:rStyle w:val="Lienhypertexte"/>
@@ -2706,7 +2706,7 @@
               <w:rPr>
                 <w:noProof/>
               </w:rPr>
-              <w:instrText xml:space="preserve"> PAGEREF _Toc243815615 \h </w:instrText>
+              <w:instrText xml:space="preserve"> PAGEREF _Toc243819306 \h </w:instrText>
             </w:r>
             <w:r>
               <w:rPr>
@@ -2749,7 +2749,7 @@
               <w14:ligatures w14:val="standardContextual"/>
             </w:rPr>
           </w:pPr>
-          <w:hyperlink w:anchor="_Toc243815616" w:history="1">
+          <w:hyperlink w:anchor="_Toc243819307" w:history="1">
             <w:r>
               <w:rPr>
                 <w:rStyle w:val="Lienhypertexte"/>
@@ -2773,7 +2773,7 @@
               <w:rPr>
                 <w:noProof/>
               </w:rPr>
-              <w:instrText xml:space="preserve"> PAGEREF _Toc243815616 \h </w:instrText>
+              <w:instrText xml:space="preserve"> PAGEREF _Toc243819307 \h </w:instrText>
             </w:r>
             <w:r>
               <w:rPr>
@@ -2816,7 +2816,7 @@
               <w14:ligatures w14:val="standardContextual"/>
             </w:rPr>
           </w:pPr>
-          <w:hyperlink w:anchor="_Toc243815617" w:history="1">
+          <w:hyperlink w:anchor="_Toc243819308" w:history="1">
             <w:r>
               <w:rPr>
                 <w:rStyle w:val="Lienhypertexte"/>
@@ -2840,7 +2840,7 @@
               <w:rPr>
                 <w:noProof/>
               </w:rPr>
-              <w:instrText xml:space="preserve"> PAGEREF _Toc243815617 \h </w:instrText>
+              <w:instrText xml:space="preserve"> PAGEREF _Toc243819308 \h </w:instrText>
             </w:r>
             <w:r>
               <w:rPr>
@@ -2883,7 +2883,7 @@
               <w14:ligatures w14:val="standardContextual"/>
             </w:rPr>
           </w:pPr>
-          <w:hyperlink w:anchor="_Toc243815618" w:history="1">
+          <w:hyperlink w:anchor="_Toc243819309" w:history="1">
             <w:r>
               <w:rPr>
                 <w:rStyle w:val="Lienhypertexte"/>
@@ -2907,7 +2907,7 @@
               <w:rPr>
                 <w:noProof/>
               </w:rPr>
-              <w:instrText xml:space="preserve"> PAGEREF _Toc243815618 \h </w:instrText>
+              <w:instrText xml:space="preserve"> PAGEREF _Toc243819309 \h </w:instrText>
             </w:r>
             <w:r>
               <w:rPr>
@@ -2950,7 +2950,7 @@
               <w14:ligatures w14:val="standardContextual"/>
             </w:rPr>
           </w:pPr>
-          <w:hyperlink w:anchor="_Toc243815619" w:history="1">
+          <w:hyperlink w:anchor="_Toc243819310" w:history="1">
             <w:r>
               <w:rPr>
                 <w:rStyle w:val="Lienhypertexte"/>
@@ -2974,7 +2974,7 @@
               <w:rPr>
                 <w:noProof/>
               </w:rPr>
-              <w:instrText xml:space="preserve"> PAGEREF _Toc243815619 \h </w:instrText>
+              <w:instrText xml:space="preserve"> PAGEREF _Toc243819310 \h </w:instrText>
             </w:r>
             <w:r>
               <w:rPr>
@@ -3017,7 +3017,7 @@
               <w14:ligatures w14:val="standardContextual"/>
             </w:rPr>
           </w:pPr>
-          <w:hyperlink w:anchor="_Toc243815620" w:history="1">
+          <w:hyperlink w:anchor="_Toc243819311" w:history="1">
             <w:r>
               <w:rPr>
                 <w:rStyle w:val="Lienhypertexte"/>
@@ -3041,7 +3041,7 @@
               <w:rPr>
                 <w:noProof/>
               </w:rPr>
-              <w:instrText xml:space="preserve"> PAGEREF _Toc243815620 \h </w:instrText>
+              <w:instrText xml:space="preserve"> PAGEREF _Toc243819311 \h </w:instrText>
             </w:r>
             <w:r>
               <w:rPr>
@@ -3084,7 +3084,7 @@
               <w14:ligatures w14:val="standardContextual"/>
             </w:rPr>
           </w:pPr>
-          <w:hyperlink w:anchor="_Toc243815621" w:history="1">
+          <w:hyperlink w:anchor="_Toc243819312" w:history="1">
             <w:r>
               <w:rPr>
                 <w:rStyle w:val="Lienhypertexte"/>
@@ -3108,7 +3108,7 @@
               <w:rPr>
                 <w:noProof/>
               </w:rPr>
-              <w:instrText xml:space="preserve"> PAGEREF _Toc243815621 \h </w:instrText>
+              <w:instrText xml:space="preserve"> PAGEREF _Toc243819312 \h </w:instrText>
             </w:r>
             <w:r>
               <w:rPr>
@@ -3147,7 +3147,7 @@
         <w:pStyle w:val="Titre1"/>
         <w:pageBreakBefore/>
       </w:pPr>
-      <w:bookmarkStart w:id="0" w:name="_Toc243815578"/>
+      <w:bookmarkStart w:id="0" w:name="_Toc243819269"/>
       <w:r>
         <w:lastRenderedPageBreak/>
         <w:t>1. Contexte et enjeux</w:t>
@@ -3991,7 +3991,7 @@
       <w:pPr>
         <w:pStyle w:val="Titre1"/>
       </w:pPr>
-      <w:bookmarkStart w:id="1" w:name="_Toc243815579"/>
+      <w:bookmarkStart w:id="1" w:name="_Toc243819270"/>
       <w:r>
         <w:t>2. Objectifs et périmètre</w:t>
       </w:r>
@@ -4013,7 +4013,7 @@
       <w:pPr>
         <w:pStyle w:val="Titre2"/>
       </w:pPr>
-      <w:bookmarkStart w:id="2" w:name="_Toc243815580"/>
+      <w:bookmarkStart w:id="2" w:name="_Toc243819271"/>
       <w:r>
         <w:t>2.1 Objectifs</w:t>
       </w:r>
@@ -4718,7 +4718,7 @@
       <w:pPr>
         <w:pStyle w:val="Titre2"/>
       </w:pPr>
-      <w:bookmarkStart w:id="3" w:name="_Toc243815581"/>
+      <w:bookmarkStart w:id="3" w:name="_Toc243819272"/>
       <w:r>
         <w:t>2.2 Périmètre de la phase 1 (pilote)</w:t>
       </w:r>
@@ -4803,7 +4803,7 @@
       <w:pPr>
         <w:pStyle w:val="Titre2"/>
       </w:pPr>
-      <w:bookmarkStart w:id="4" w:name="_Toc243815582"/>
+      <w:bookmarkStart w:id="4" w:name="_Toc243819273"/>
       <w:r>
         <w:t>2.3 Hors périmètre</w:t>
       </w:r>
@@ -4865,7 +4865,7 @@
       <w:pPr>
         <w:pStyle w:val="Titre1"/>
       </w:pPr>
-      <w:bookmarkStart w:id="5" w:name="_Toc243815583"/>
+      <w:bookmarkStart w:id="5" w:name="_Toc243819274"/>
       <w:r>
         <w:t>3. Parties prenantes et utilisateurs</w:t>
       </w:r>
@@ -5772,7 +5772,7 @@
       <w:pPr>
         <w:pStyle w:val="Titre1"/>
       </w:pPr>
-      <w:bookmarkStart w:id="6" w:name="_Toc243815584"/>
+      <w:bookmarkStart w:id="6" w:name="_Toc243819275"/>
       <w:r>
         <w:t>4. Principes de conception</w:t>
       </w:r>
@@ -5914,7 +5914,7 @@
       <w:pPr>
         <w:pStyle w:val="Titre1"/>
       </w:pPr>
-      <w:bookmarkStart w:id="7" w:name="_Toc243815585"/>
+      <w:bookmarkStart w:id="7" w:name="_Toc243819276"/>
       <w:r>
         <w:t>5. Exigences fonctionnelles</w:t>
       </w:r>
@@ -5939,7 +5939,7 @@
       <w:pPr>
         <w:pStyle w:val="Titre2"/>
       </w:pPr>
-      <w:bookmarkStart w:id="8" w:name="_Toc243815586"/>
+      <w:bookmarkStart w:id="8" w:name="_Toc243819277"/>
       <w:r>
         <w:lastRenderedPageBreak/>
         <w:t>5.1 Indice de Cadre de Vie (ICV) et carte des inégalités</w:t>
@@ -7002,7 +7002,7 @@
       <w:pPr>
         <w:pStyle w:val="Titre2"/>
       </w:pPr>
-      <w:bookmarkStart w:id="9" w:name="_Toc243815587"/>
+      <w:bookmarkStart w:id="9" w:name="_Toc243819278"/>
       <w:r>
         <w:t>5.2 Conception assistée</w:t>
       </w:r>
@@ -8705,7 +8705,7 @@
       <w:pPr>
         <w:pStyle w:val="Titre2"/>
       </w:pPr>
-      <w:bookmarkStart w:id="10" w:name="_Toc243815588"/>
+      <w:bookmarkStart w:id="10" w:name="_Toc243819279"/>
       <w:r>
         <w:t>5.3 Arbitrage des investissements</w:t>
       </w:r>
@@ -10151,7 +10151,7 @@
       <w:pPr>
         <w:pStyle w:val="Titre2"/>
       </w:pPr>
-      <w:bookmarkStart w:id="11" w:name="_Toc243815589"/>
+      <w:bookmarkStart w:id="11" w:name="_Toc243819280"/>
       <w:r>
         <w:t>5.4 Prospective 2050</w:t>
       </w:r>
@@ -10829,7 +10829,7 @@
       <w:pPr>
         <w:pStyle w:val="Titre2"/>
       </w:pPr>
-      <w:bookmarkStart w:id="12" w:name="_Toc243815590"/>
+      <w:bookmarkStart w:id="12" w:name="_Toc243819281"/>
       <w:r>
         <w:lastRenderedPageBreak/>
         <w:t>5.5 Résilience et climat</w:t>
@@ -11636,7 +11636,7 @@
       <w:pPr>
         <w:pStyle w:val="Titre2"/>
       </w:pPr>
-      <w:bookmarkStart w:id="13" w:name="_Toc243815591"/>
+      <w:bookmarkStart w:id="13" w:name="_Toc243819282"/>
       <w:r>
         <w:t>5.6 Mobilité multimodale</w:t>
       </w:r>
@@ -12186,7 +12186,7 @@
       <w:pPr>
         <w:pStyle w:val="Titre2"/>
       </w:pPr>
-      <w:bookmarkStart w:id="14" w:name="_Toc243815592"/>
+      <w:bookmarkStart w:id="14" w:name="_Toc243819283"/>
       <w:r>
         <w:t>5.7 Transition des quartiers</w:t>
       </w:r>
@@ -12992,7 +12992,7 @@
       <w:pPr>
         <w:pStyle w:val="Titre2"/>
       </w:pPr>
-      <w:bookmarkStart w:id="15" w:name="_Toc243815593"/>
+      <w:bookmarkStart w:id="15" w:name="_Toc243819284"/>
       <w:r>
         <w:t>5.8 Application citoyenne</w:t>
       </w:r>
@@ -13799,7 +13799,7 @@
       <w:pPr>
         <w:pStyle w:val="Titre2"/>
       </w:pPr>
-      <w:bookmarkStart w:id="16" w:name="_Toc243815594"/>
+      <w:bookmarkStart w:id="16" w:name="_Toc243819285"/>
       <w:r>
         <w:t>5.9 Assistant IA</w:t>
       </w:r>
@@ -14349,7 +14349,7 @@
       <w:pPr>
         <w:pStyle w:val="Titre2"/>
       </w:pPr>
-      <w:bookmarkStart w:id="17" w:name="_Toc243815595"/>
+      <w:bookmarkStart w:id="17" w:name="_Toc243819286"/>
       <w:r>
         <w:t>5.10 Fonctions transverses</w:t>
       </w:r>
@@ -15283,7 +15283,7 @@
       <w:pPr>
         <w:pStyle w:val="Titre1"/>
       </w:pPr>
-      <w:bookmarkStart w:id="18" w:name="_Toc243815596"/>
+      <w:bookmarkStart w:id="18" w:name="_Toc243819287"/>
       <w:r>
         <w:t>6. Intelligence artificielle</w:t>
       </w:r>
@@ -16217,7 +16217,7 @@
       <w:pPr>
         <w:pStyle w:val="Titre2"/>
       </w:pPr>
-      <w:bookmarkStart w:id="19" w:name="_Toc243815597"/>
+      <w:bookmarkStart w:id="19" w:name="_Toc243819288"/>
       <w:r>
         <w:t>6.1 Garde-fous</w:t>
       </w:r>
@@ -16300,7 +16300,7 @@
       <w:pPr>
         <w:pStyle w:val="Titre1"/>
       </w:pPr>
-      <w:bookmarkStart w:id="20" w:name="_Toc243815598"/>
+      <w:bookmarkStart w:id="20" w:name="_Toc243819289"/>
       <w:r>
         <w:t>7. Données</w:t>
       </w:r>
@@ -17610,7 +17610,7 @@
       <w:pPr>
         <w:pStyle w:val="Titre2"/>
       </w:pPr>
-      <w:bookmarkStart w:id="21" w:name="_Toc243815599"/>
+      <w:bookmarkStart w:id="21" w:name="_Toc243819290"/>
       <w:r>
         <w:t>7.1 Règles de gouvernance des données</w:t>
       </w:r>
@@ -17700,7 +17700,7 @@
       <w:pPr>
         <w:pStyle w:val="Titre1"/>
       </w:pPr>
-      <w:bookmarkStart w:id="22" w:name="_Toc243815600"/>
+      <w:bookmarkStart w:id="22" w:name="_Toc243819291"/>
       <w:r>
         <w:t>8. Exigences non fonctionnelles</w:t>
       </w:r>
@@ -18895,7 +18895,7 @@
       <w:pPr>
         <w:pStyle w:val="Titre1"/>
       </w:pPr>
-      <w:bookmarkStart w:id="23" w:name="_Toc243815601"/>
+      <w:bookmarkStart w:id="23" w:name="_Toc243819292"/>
       <w:r>
         <w:t>9. Architecture technique</w:t>
       </w:r>
@@ -18925,7 +18925,7 @@
         </w:rPr>
         <w:lastRenderedPageBreak/>
         <w:drawing>
-          <wp:inline distT="0" distB="0" distL="0" distR="0" wp14:anchorId="7227CFD6" wp14:editId="7C5D362E">
+          <wp:inline distT="0" distB="0" distL="0" distR="0" wp14:anchorId="53D749BD" wp14:editId="0534BEFD">
             <wp:extent cx="6096000" cy="3724275"/>
             <wp:effectExtent l="0" t="0" r="0" b="0"/>
             <wp:docPr id="1" name="architecture.png" descr="Figure 1 — Architecture de Cadre+ : trait plein = en place, pointillé = prévu." title="Figure 1 — Architecture de Cadre+ : trait plein = en place, pointillé = prévu."/>
@@ -19876,7 +19876,7 @@
       <w:pPr>
         <w:pStyle w:val="Titre1"/>
       </w:pPr>
-      <w:bookmarkStart w:id="24" w:name="_Toc243815602"/>
+      <w:bookmarkStart w:id="24" w:name="_Toc243819293"/>
       <w:r>
         <w:lastRenderedPageBreak/>
         <w:t>10. Sécurité, responsabilité et gouvernance</w:t>
@@ -19902,7 +19902,7 @@
       <w:pPr>
         <w:pStyle w:val="Titre2"/>
       </w:pPr>
-      <w:bookmarkStart w:id="25" w:name="_Toc243815603"/>
+      <w:bookmarkStart w:id="25" w:name="_Toc243819294"/>
       <w:r>
         <w:t>10.1 Responsabilité</w:t>
       </w:r>
@@ -19951,7 +19951,7 @@
       <w:pPr>
         <w:pStyle w:val="Titre2"/>
       </w:pPr>
-      <w:bookmarkStart w:id="26" w:name="_Toc243815604"/>
+      <w:bookmarkStart w:id="26" w:name="_Toc243819295"/>
       <w:r>
         <w:t>10.2 Propriété intellectuelle et souveraineté</w:t>
       </w:r>
@@ -20000,7 +20000,7 @@
       <w:pPr>
         <w:pStyle w:val="Titre2"/>
       </w:pPr>
-      <w:bookmarkStart w:id="27" w:name="_Toc243815605"/>
+      <w:bookmarkStart w:id="27" w:name="_Toc243819296"/>
       <w:r>
         <w:t>10.3 Sécurité</w:t>
       </w:r>
@@ -20049,7 +20049,7 @@
       <w:pPr>
         <w:pStyle w:val="Titre2"/>
       </w:pPr>
-      <w:bookmarkStart w:id="28" w:name="_Toc243815606"/>
+      <w:bookmarkStart w:id="28" w:name="_Toc243819297"/>
       <w:r>
         <w:t>10.4 Gouvernance du projet</w:t>
       </w:r>
@@ -20098,7 +20098,7 @@
       <w:pPr>
         <w:pStyle w:val="Titre1"/>
       </w:pPr>
-      <w:bookmarkStart w:id="29" w:name="_Toc243815607"/>
+      <w:bookmarkStart w:id="29" w:name="_Toc243819298"/>
       <w:r>
         <w:t>11. Livrables</w:t>
       </w:r>
@@ -21290,7 +21290,7 @@
       <w:pPr>
         <w:pStyle w:val="Titre1"/>
       </w:pPr>
-      <w:bookmarkStart w:id="30" w:name="_Toc243815608"/>
+      <w:bookmarkStart w:id="30" w:name="_Toc243819299"/>
       <w:r>
         <w:t>12. Planification par phases</w:t>
       </w:r>
@@ -21319,7 +21319,7 @@
           <w:noProof/>
         </w:rPr>
         <w:drawing>
-          <wp:inline distT="0" distB="0" distL="0" distR="0" wp14:anchorId="1EF48337" wp14:editId="255A9C3D">
+          <wp:inline distT="0" distB="0" distL="0" distR="0" wp14:anchorId="538FB5E4" wp14:editId="4B41DEB1">
             <wp:extent cx="6096000" cy="2305050"/>
             <wp:effectExtent l="0" t="0" r="0" b="0"/>
             <wp:docPr id="2" name="feuille-de-route.png" descr="Figure 2 — Phases du projet et critères de passage (G0, G1, G2)." title="Figure 2 — Phases du projet et critères de passage (G0, G1, G2)."/>
@@ -21883,7 +21883,7 @@
       <w:pPr>
         <w:pStyle w:val="Titre1"/>
       </w:pPr>
-      <w:bookmarkStart w:id="31" w:name="_Toc243815609"/>
+      <w:bookmarkStart w:id="31" w:name="_Toc243819300"/>
       <w:r>
         <w:t>13. Indicateurs de succès et critères de recette</w:t>
       </w:r>
@@ -21893,7 +21893,7 @@
       <w:pPr>
         <w:pStyle w:val="Titre2"/>
       </w:pPr>
-      <w:bookmarkStart w:id="32" w:name="_Toc243815610"/>
+      <w:bookmarkStart w:id="32" w:name="_Toc243819301"/>
       <w:r>
         <w:t>13.1 Indicateurs du pilote</w:t>
       </w:r>
@@ -22802,7 +22802,7 @@
       <w:pPr>
         <w:pStyle w:val="Titre2"/>
       </w:pPr>
-      <w:bookmarkStart w:id="33" w:name="_Toc243815611"/>
+      <w:bookmarkStart w:id="33" w:name="_Toc243819302"/>
       <w:r>
         <w:t>13.2 Critères de recette technique</w:t>
       </w:r>
@@ -22904,7 +22904,7 @@
       <w:pPr>
         <w:pStyle w:val="Titre1"/>
       </w:pPr>
-      <w:bookmarkStart w:id="34" w:name="_Toc243815612"/>
+      <w:bookmarkStart w:id="34" w:name="_Toc243819303"/>
       <w:r>
         <w:t>14. Risques et mesures de maîtrise</w:t>
       </w:r>
@@ -24033,7 +24033,7 @@
       <w:pPr>
         <w:pStyle w:val="Titre1"/>
       </w:pPr>
-      <w:bookmarkStart w:id="35" w:name="_Toc243815613"/>
+      <w:bookmarkStart w:id="35" w:name="_Toc243819304"/>
       <w:r>
         <w:t>15. Ressources et budget</w:t>
       </w:r>
@@ -24058,7 +24058,7 @@
       <w:pPr>
         <w:pStyle w:val="Titre2"/>
       </w:pPr>
-      <w:bookmarkStart w:id="36" w:name="_Toc243815614"/>
+      <w:bookmarkStart w:id="36" w:name="_Toc243819305"/>
       <w:r>
         <w:lastRenderedPageBreak/>
         <w:t>15.1 Équipe cible de la phase 1</w:t>
@@ -24858,7 +24858,7 @@
       <w:pPr>
         <w:pStyle w:val="Titre2"/>
       </w:pPr>
-      <w:bookmarkStart w:id="37" w:name="_Toc243815615"/>
+      <w:bookmarkStart w:id="37" w:name="_Toc243819306"/>
       <w:r>
         <w:t>15.2 Postes de dépense</w:t>
       </w:r>
@@ -25657,7 +25657,7 @@
       <w:pPr>
         <w:pStyle w:val="Titre1"/>
       </w:pPr>
-      <w:bookmarkStart w:id="38" w:name="_Toc243815616"/>
+      <w:bookmarkStart w:id="38" w:name="_Toc243819307"/>
       <w:r>
         <w:t>16. Annexes</w:t>
       </w:r>
@@ -25667,7 +25667,7 @@
       <w:pPr>
         <w:pStyle w:val="Titre2"/>
       </w:pPr>
-      <w:bookmarkStart w:id="39" w:name="_Toc243815617"/>
+      <w:bookmarkStart w:id="39" w:name="_Toc243819308"/>
       <w:r>
         <w:t>Annexe A — Formules</w:t>
       </w:r>
@@ -26476,7 +26476,7 @@
       <w:pPr>
         <w:pStyle w:val="Titre2"/>
       </w:pPr>
-      <w:bookmarkStart w:id="40" w:name="_Toc243815618"/>
+      <w:bookmarkStart w:id="40" w:name="_Toc243819309"/>
       <w:r>
         <w:t>Annexe B — Hypothèses de coût de la démonstration</w:t>
       </w:r>
@@ -27115,7 +27115,7 @@
       <w:pPr>
         <w:pStyle w:val="Titre2"/>
       </w:pPr>
-      <w:bookmarkStart w:id="41" w:name="_Toc243815619"/>
+      <w:bookmarkStart w:id="41" w:name="_Toc243819310"/>
       <w:r>
         <w:t>Annexe C — État d'avancement de la démonstration</w:t>
       </w:r>
@@ -27126,7 +27126,11 @@
         <w:spacing w:after="120"/>
       </w:pPr>
       <w:r>
-        <w:t>Au jour de la rédaction, la démonstration comprend la carte de l'ICV, la Conception assistée (automatique et manuelle), l'Arbitrage des investissements (automatique, mixte, manuel), l'Assistant IA, l'aide intégrée et le mode d'emploi, sur données synthétiques. Les autres modules et l'application citoyenne ne sont pas commencés. Les captures ci-dessous montrent l'application réelle.</w:t>
+        <w:t xml:space="preserve">Au jour de la rédaction, la démonstration comprend une page d'accueil de présentation, la carte de l'ICV avec fiche explicative par quartier, la Conception assistée (automatique et manuelle), l'Arbitrage des investissements (automatique, mixte, manuel), l'Assistant IA, l'aide intégrée et le mode d'emploi, sur </w:t>
+      </w:r>
+      <w:r>
+        <w:lastRenderedPageBreak/>
+        <w:t>données synthétiques. Les autres modules et l'application citoyenne ne sont pas commencés. Les captures ci-dessous montrent l'application réelle.</w:t>
       </w:r>
     </w:p>
     <w:p>
@@ -27139,12 +27143,11 @@
         <w:rPr>
           <w:noProof/>
         </w:rPr>
-        <w:lastRenderedPageBreak/>
         <w:drawing>
-          <wp:inline distT="0" distB="0" distL="0" distR="0" wp14:anchorId="2028A009" wp14:editId="519044DF">
+          <wp:inline distT="0" distB="0" distL="0" distR="0" wp14:anchorId="39091799" wp14:editId="2CDB269E">
             <wp:extent cx="5715000" cy="3571875"/>
             <wp:effectExtent l="0" t="0" r="0" b="0"/>
-            <wp:docPr id="3" name="capture-carte-icv.png" descr="Figure 3 — Carte de l'ICV des huit quartiers d'Abomey-Calavi (données synthétiques ; les carrés sont illustratifs)." title="Figure 3 — Carte de l'ICV des huit quartiers d'Abomey-Calavi (données synthétiques ; les carrés sont illustratifs)."/>
+            <wp:docPr id="3" name="capture-carte-icv.png" descr="Figure 3 — Carte de l'ICV des huit quartiers d'Abomey-Calavi (données synthétiques ; les zones en forme de tache sont illustratives)." title="Figure 3 — Carte de l'ICV des huit quartiers d'Abomey-Calavi (données synthétiques ; les zones en forme de tache sont illustratives)."/>
             <wp:cNvGraphicFramePr>
               <a:graphicFrameLocks xmlns:a="http://schemas.openxmlformats.org/drawingml/2006/main" noChangeAspect="1"/>
             </wp:cNvGraphicFramePr>
@@ -27193,7 +27196,7 @@
           <w:sz w:val="18"/>
           <w:szCs w:val="18"/>
         </w:rPr>
-        <w:t>Figure 3 — Carte de l'ICV des huit quartiers d'Abomey-Calavi (données synthétiques ; les carrés sont illustratifs).</w:t>
+        <w:t>Figure 3 — Carte de l'ICV des huit quartiers d'Abomey-Calavi (données synthétiques ; les zones en forme de tache sont illustratives).</w:t>
       </w:r>
     </w:p>
     <w:p>
@@ -27207,7 +27210,7 @@
           <w:noProof/>
         </w:rPr>
         <w:drawing>
-          <wp:inline distT="0" distB="0" distL="0" distR="0" wp14:anchorId="26AF036B" wp14:editId="2322E2A2">
+          <wp:inline distT="0" distB="0" distL="0" distR="0" wp14:anchorId="6E6553A9" wp14:editId="4047798C">
             <wp:extent cx="5715000" cy="3571875"/>
             <wp:effectExtent l="0" t="0" r="0" b="0"/>
             <wp:docPr id="4" name="capture-mode-manuel.png" descr="Figure 4 — Conception assistée en mode manuel : le bâtiment déplacé trop près de la voie est signalé non conforme." title="Figure 4 — Conception assistée en mode manuel : le bâtiment déplacé trop près de la voie est signalé non conforme."/>
@@ -27274,7 +27277,7 @@
         </w:rPr>
         <w:lastRenderedPageBreak/>
         <w:drawing>
-          <wp:inline distT="0" distB="0" distL="0" distR="0" wp14:anchorId="0C5D34A0" wp14:editId="6EB89472">
+          <wp:inline distT="0" distB="0" distL="0" distR="0" wp14:anchorId="110ED324" wp14:editId="00C6D969">
             <wp:extent cx="5715000" cy="3571875"/>
             <wp:effectExtent l="0" t="0" r="0" b="0"/>
             <wp:docPr id="5" name="capture-investissements.png" descr="Figure 5 — Arbitrage des investissements en mode mixte : un quartier décidé à la main, les autres complétés par l'optimiseur." title="Figure 5 — Arbitrage des investissements en mode mixte : un quartier décidé à la main, les autres complétés par l'optimiseur."/>
@@ -27333,7 +27336,7 @@
       <w:pPr>
         <w:pStyle w:val="Titre2"/>
       </w:pPr>
-      <w:bookmarkStart w:id="42" w:name="_Toc243815620"/>
+      <w:bookmarkStart w:id="42" w:name="_Toc243819311"/>
       <w:r>
         <w:t>Annexe D — Glossaire</w:t>
       </w:r>
@@ -28215,7 +28218,7 @@
       <w:pPr>
         <w:pStyle w:val="Titre2"/>
       </w:pPr>
-      <w:bookmarkStart w:id="43" w:name="_Toc243815621"/>
+      <w:bookmarkStart w:id="43" w:name="_Toc243819312"/>
       <w:r>
         <w:t>Annexe E — Questions ouvertes à trancher avec le ministère</w:t>
       </w:r>
@@ -28542,10 +28545,10 @@
 <file path=word/numbering.xml><?xml version="1.0" encoding="utf-8"?>
 <w:numbering xmlns:wpc="http://schemas.microsoft.com/office/word/2010/wordprocessingCanvas" xmlns:cx="http://schemas.microsoft.com/office/drawing/2014/chartex" xmlns:cx1="http://schemas.microsoft.com/office/drawing/2015/9/8/chartex" xmlns:cx2="http://schemas.microsoft.com/office/drawing/2015/10/21/chartex" xmlns:cx3="http://schemas.microsoft.com/office/drawing/2016/5/9/chartex" xmlns:cx4="http://schemas.microsoft.com/office/drawing/2016/5/10/chartex" xmlns:cx5="http://schemas.microsoft.com/office/drawing/2016/5/11/chartex" xmlns:cx6="http://schemas.microsoft.com/office/drawing/2016/5/12/chartex" xmlns:cx7="http://schemas.microsoft.com/office/drawing/2016/5/13/chartex" xmlns:cx8="http://schemas.microsoft.com/office/drawing/2016/5/14/chartex" xmlns:mc="http://schemas.openxmlformats.org/markup-compatibility/2006" xmlns:aink="http://schemas.microsoft.com/office/drawing/2016/ink" xmlns:am3d="http://schemas.microsoft.com/office/drawing/2017/model3d" xmlns:o="urn:schemas-microsoft-com:office:office" xmlns:oel="http://schemas.microsoft.com/office/2019/extlst" xmlns:r="http://schemas.openxmlformats.org/officeDocument/2006/relationships" xmlns:m="http://schemas.openxmlformats.org/officeDocument/2006/math" xmlns:v="urn:schemas-microsoft-com:vml" xmlns:wp14="http://schemas.microsoft.com/office/word/2010/wordprocessingDrawing" xmlns:wp="http://schemas.openxmlformats.org/drawingml/2006/wordprocessingDrawing" xmlns:w10="urn:schemas-microsoft-com:office:word" xmlns:w="http://schemas.openxmlformats.org/wordprocessingml/2006/main" xmlns:w14="http://schemas.microsoft.com/office/word/2010/wordml" xmlns:w15="http://schemas.microsoft.com/office/word/2012/wordml" xmlns:w16cex="http://schemas.microsoft.com/office/word/2018/wordml/cex" xmlns:w16cid="http://schemas.microsoft.com/office/word/2016/wordml/cid" xmlns:w16="http://schemas.microsoft.com/office/word/2018/wordml" xmlns:w16du="http://schemas.microsoft.com/office/word/2023/wordml/word16du" xmlns:w16sdtdh="http://schemas.microsoft.com/office/word/2020/wordml/sdtdatahash" xmlns:w16sdtfl="http://schemas.microsoft.com/office/word/2024/wordml/sdtformatlock" xmlns:w16se="http://schemas.microsoft.com/office/word/2015/wordml/symex" xmlns:wpg="http://schemas.microsoft.com/office/word/2010/wordprocessingGroup" xmlns:wpi="http://schemas.microsoft.com/office/word/2010/wordprocessingInk" xmlns:wne="http://schemas.microsoft.com/office/word/2006/wordml" xmlns:wps="http://schemas.microsoft.com/office/word/2010/wordprocessingShape" mc:Ignorable="w14 w15 w16se w16cid w16 w16cex w16sdtdh w16sdtfl w16du wp14">
   <w:abstractNum w:abstractNumId="0" w15:restartNumberingAfterBreak="0">
-    <w:nsid w:val="146A5FA7"/>
+    <w:nsid w:val="0B254D84"/>
     <w:multiLevelType w:val="hybridMultilevel"/>
-    <w:tmpl w:val="AECA1286"/>
-    <w:lvl w:ilvl="0" w:tplc="0BD67000">
+    <w:tmpl w:val="098EFAB6"/>
+    <w:lvl w:ilvl="0" w:tplc="C43CBBF0">
       <w:start w:val="1"/>
       <w:numFmt w:val="bullet"/>
       <w:lvlText w:val="•"/>
@@ -28554,106 +28557,52 @@
         <w:ind w:left="567" w:hanging="283"/>
       </w:pPr>
     </w:lvl>
-    <w:lvl w:ilvl="1" w:tplc="30BE636E">
+    <w:lvl w:ilvl="1" w:tplc="9FA049AA">
       <w:numFmt w:val="decimal"/>
       <w:lvlText w:val=""/>
       <w:lvlJc w:val="left"/>
     </w:lvl>
-    <w:lvl w:ilvl="2" w:tplc="F8FEDFD8">
+    <w:lvl w:ilvl="2" w:tplc="61D23372">
       <w:numFmt w:val="decimal"/>
       <w:lvlText w:val=""/>
       <w:lvlJc w:val="left"/>
     </w:lvl>
-    <w:lvl w:ilvl="3" w:tplc="DDEEB666">
+    <w:lvl w:ilvl="3" w:tplc="E6C01428">
       <w:numFmt w:val="decimal"/>
       <w:lvlText w:val=""/>
       <w:lvlJc w:val="left"/>
     </w:lvl>
-    <w:lvl w:ilvl="4" w:tplc="1A4AD482">
+    <w:lvl w:ilvl="4" w:tplc="8F8C74B4">
       <w:numFmt w:val="decimal"/>
       <w:lvlText w:val=""/>
       <w:lvlJc w:val="left"/>
     </w:lvl>
-    <w:lvl w:ilvl="5" w:tplc="1DCA1944">
+    <w:lvl w:ilvl="5" w:tplc="AFB89598">
       <w:numFmt w:val="decimal"/>
       <w:lvlText w:val=""/>
       <w:lvlJc w:val="left"/>
     </w:lvl>
-    <w:lvl w:ilvl="6" w:tplc="84647E6E">
+    <w:lvl w:ilvl="6" w:tplc="8CE246FC">
       <w:numFmt w:val="decimal"/>
       <w:lvlText w:val=""/>
       <w:lvlJc w:val="left"/>
     </w:lvl>
-    <w:lvl w:ilvl="7" w:tplc="B2B2F112">
+    <w:lvl w:ilvl="7" w:tplc="9796DC68">
       <w:numFmt w:val="decimal"/>
       <w:lvlText w:val=""/>
       <w:lvlJc w:val="left"/>
     </w:lvl>
-    <w:lvl w:ilvl="8" w:tplc="E9980802">
+    <w:lvl w:ilvl="8" w:tplc="0B52B1EC">
       <w:numFmt w:val="decimal"/>
       <w:lvlText w:val=""/>
       <w:lvlJc w:val="left"/>
     </w:lvl>
   </w:abstractNum>
   <w:abstractNum w:abstractNumId="1" w15:restartNumberingAfterBreak="0">
-    <w:nsid w:val="235C2D78"/>
+    <w:nsid w:val="0DDB4047"/>
     <w:multiLevelType w:val="hybridMultilevel"/>
-    <w:tmpl w:val="111EE840"/>
-    <w:lvl w:ilvl="0" w:tplc="5E28B50E">
-      <w:start w:val="1"/>
-      <w:numFmt w:val="decimal"/>
-      <w:lvlText w:val="%1."/>
-      <w:lvlJc w:val="left"/>
-      <w:pPr>
-        <w:ind w:left="567" w:hanging="340"/>
-      </w:pPr>
-    </w:lvl>
-    <w:lvl w:ilvl="1" w:tplc="8F1208CE">
-      <w:numFmt w:val="decimal"/>
-      <w:lvlText w:val=""/>
-      <w:lvlJc w:val="left"/>
-    </w:lvl>
-    <w:lvl w:ilvl="2" w:tplc="3CC236F6">
-      <w:numFmt w:val="decimal"/>
-      <w:lvlText w:val=""/>
-      <w:lvlJc w:val="left"/>
-    </w:lvl>
-    <w:lvl w:ilvl="3" w:tplc="02AE3786">
-      <w:numFmt w:val="decimal"/>
-      <w:lvlText w:val=""/>
-      <w:lvlJc w:val="left"/>
-    </w:lvl>
-    <w:lvl w:ilvl="4" w:tplc="6004F81E">
-      <w:numFmt w:val="decimal"/>
-      <w:lvlText w:val=""/>
-      <w:lvlJc w:val="left"/>
-    </w:lvl>
-    <w:lvl w:ilvl="5" w:tplc="40B25E76">
-      <w:numFmt w:val="decimal"/>
-      <w:lvlText w:val=""/>
-      <w:lvlJc w:val="left"/>
-    </w:lvl>
-    <w:lvl w:ilvl="6" w:tplc="667C10B0">
-      <w:numFmt w:val="decimal"/>
-      <w:lvlText w:val=""/>
-      <w:lvlJc w:val="left"/>
-    </w:lvl>
-    <w:lvl w:ilvl="7" w:tplc="73CCB1EE">
-      <w:numFmt w:val="decimal"/>
-      <w:lvlText w:val=""/>
-      <w:lvlJc w:val="left"/>
-    </w:lvl>
-    <w:lvl w:ilvl="8" w:tplc="8BD86D3A">
-      <w:numFmt w:val="decimal"/>
-      <w:lvlText w:val=""/>
-      <w:lvlJc w:val="left"/>
-    </w:lvl>
-  </w:abstractNum>
-  <w:abstractNum w:abstractNumId="2" w15:restartNumberingAfterBreak="0">
-    <w:nsid w:val="4ABA08A7"/>
-    <w:multiLevelType w:val="hybridMultilevel"/>
-    <w:tmpl w:val="9B4C2530"/>
-    <w:lvl w:ilvl="0" w:tplc="2A322D98" w:tentative="1">
+    <w:tmpl w:val="D00E3ECA"/>
+    <w:lvl w:ilvl="0" w:tplc="23142DC2" w:tentative="1">
       <w:start w:val="1"/>
       <w:numFmt w:val="bullet"/>
       <w:lvlText w:val="●"/>
@@ -28662,7 +28611,7 @@
         <w:ind w:left="720" w:hanging="360"/>
       </w:pPr>
     </w:lvl>
-    <w:lvl w:ilvl="1" w:tplc="6AA84772" w:tentative="1">
+    <w:lvl w:ilvl="1" w:tplc="ED4AB8BE" w:tentative="1">
       <w:start w:val="1"/>
       <w:numFmt w:val="bullet"/>
       <w:lvlText w:val="○"/>
@@ -28671,7 +28620,7 @@
         <w:ind w:left="1440" w:hanging="360"/>
       </w:pPr>
     </w:lvl>
-    <w:lvl w:ilvl="2" w:tplc="34168498" w:tentative="1">
+    <w:lvl w:ilvl="2" w:tplc="FA9E05CC" w:tentative="1">
       <w:start w:val="1"/>
       <w:numFmt w:val="bullet"/>
       <w:lvlText w:val="■"/>
@@ -28680,7 +28629,7 @@
         <w:ind w:left="2160" w:hanging="360"/>
       </w:pPr>
     </w:lvl>
-    <w:lvl w:ilvl="3" w:tplc="1A521A88" w:tentative="1">
+    <w:lvl w:ilvl="3" w:tplc="B94287AA" w:tentative="1">
       <w:start w:val="1"/>
       <w:numFmt w:val="bullet"/>
       <w:lvlText w:val="●"/>
@@ -28689,7 +28638,7 @@
         <w:ind w:left="2880" w:hanging="360"/>
       </w:pPr>
     </w:lvl>
-    <w:lvl w:ilvl="4" w:tplc="507AEF5C" w:tentative="1">
+    <w:lvl w:ilvl="4" w:tplc="F8C64AA4" w:tentative="1">
       <w:start w:val="1"/>
       <w:numFmt w:val="bullet"/>
       <w:lvlText w:val="○"/>
@@ -28698,7 +28647,7 @@
         <w:ind w:left="3600" w:hanging="360"/>
       </w:pPr>
     </w:lvl>
-    <w:lvl w:ilvl="5" w:tplc="44E2EFBC" w:tentative="1">
+    <w:lvl w:ilvl="5" w:tplc="04CA2C00" w:tentative="1">
       <w:start w:val="1"/>
       <w:numFmt w:val="bullet"/>
       <w:lvlText w:val="■"/>
@@ -28707,7 +28656,7 @@
         <w:ind w:left="4320" w:hanging="360"/>
       </w:pPr>
     </w:lvl>
-    <w:lvl w:ilvl="6" w:tplc="9D4CEE98" w:tentative="1">
+    <w:lvl w:ilvl="6" w:tplc="82906D5E" w:tentative="1">
       <w:start w:val="1"/>
       <w:numFmt w:val="bullet"/>
       <w:lvlText w:val="●"/>
@@ -28716,7 +28665,7 @@
         <w:ind w:left="5040" w:hanging="360"/>
       </w:pPr>
     </w:lvl>
-    <w:lvl w:ilvl="7" w:tplc="FB06E238" w:tentative="1">
+    <w:lvl w:ilvl="7" w:tplc="10ACD566" w:tentative="1">
       <w:start w:val="1"/>
       <w:numFmt w:val="bullet"/>
       <w:lvlText w:val="●"/>
@@ -28725,7 +28674,7 @@
         <w:ind w:left="5760" w:hanging="360"/>
       </w:pPr>
     </w:lvl>
-    <w:lvl w:ilvl="8" w:tplc="188299DC" w:tentative="1">
+    <w:lvl w:ilvl="8" w:tplc="4FFA8080" w:tentative="1">
       <w:start w:val="1"/>
       <w:numFmt w:val="bullet"/>
       <w:lvlText w:val="●"/>
@@ -28735,11 +28684,11 @@
       </w:pPr>
     </w:lvl>
   </w:abstractNum>
-  <w:abstractNum w:abstractNumId="3" w15:restartNumberingAfterBreak="0">
-    <w:nsid w:val="645E2C6B"/>
+  <w:abstractNum w:abstractNumId="2" w15:restartNumberingAfterBreak="0">
+    <w:nsid w:val="214A4EE5"/>
     <w:multiLevelType w:val="hybridMultilevel"/>
-    <w:tmpl w:val="6FA0F028"/>
-    <w:lvl w:ilvl="0" w:tplc="AF6E91F8">
+    <w:tmpl w:val="FC3AEC08"/>
+    <w:lvl w:ilvl="0" w:tplc="6D061C80">
       <w:start w:val="1"/>
       <w:numFmt w:val="decimal"/>
       <w:lvlText w:val="%1."/>
@@ -28748,52 +28697,52 @@
         <w:ind w:left="567" w:hanging="340"/>
       </w:pPr>
     </w:lvl>
-    <w:lvl w:ilvl="1" w:tplc="5660FEC4">
+    <w:lvl w:ilvl="1" w:tplc="E266064C">
       <w:numFmt w:val="decimal"/>
       <w:lvlText w:val=""/>
       <w:lvlJc w:val="left"/>
     </w:lvl>
-    <w:lvl w:ilvl="2" w:tplc="36F2691E">
+    <w:lvl w:ilvl="2" w:tplc="D046B7D2">
       <w:numFmt w:val="decimal"/>
       <w:lvlText w:val=""/>
       <w:lvlJc w:val="left"/>
     </w:lvl>
-    <w:lvl w:ilvl="3" w:tplc="FF808AEC">
+    <w:lvl w:ilvl="3" w:tplc="7A660FB0">
       <w:numFmt w:val="decimal"/>
       <w:lvlText w:val=""/>
       <w:lvlJc w:val="left"/>
     </w:lvl>
-    <w:lvl w:ilvl="4" w:tplc="03067622">
+    <w:lvl w:ilvl="4" w:tplc="2E4CA88E">
       <w:numFmt w:val="decimal"/>
       <w:lvlText w:val=""/>
       <w:lvlJc w:val="left"/>
     </w:lvl>
-    <w:lvl w:ilvl="5" w:tplc="7B1A0DCC">
+    <w:lvl w:ilvl="5" w:tplc="E3166BA0">
       <w:numFmt w:val="decimal"/>
       <w:lvlText w:val=""/>
       <w:lvlJc w:val="left"/>
     </w:lvl>
-    <w:lvl w:ilvl="6" w:tplc="D1C056D0">
+    <w:lvl w:ilvl="6" w:tplc="79A89B74">
       <w:numFmt w:val="decimal"/>
       <w:lvlText w:val=""/>
       <w:lvlJc w:val="left"/>
     </w:lvl>
-    <w:lvl w:ilvl="7" w:tplc="C45ED8B4">
+    <w:lvl w:ilvl="7" w:tplc="3CB8C7D4">
       <w:numFmt w:val="decimal"/>
       <w:lvlText w:val=""/>
       <w:lvlJc w:val="left"/>
     </w:lvl>
-    <w:lvl w:ilvl="8" w:tplc="0914899A">
+    <w:lvl w:ilvl="8" w:tplc="ADF078F6">
       <w:numFmt w:val="decimal"/>
       <w:lvlText w:val=""/>
       <w:lvlJc w:val="left"/>
     </w:lvl>
   </w:abstractNum>
-  <w:abstractNum w:abstractNumId="4" w15:restartNumberingAfterBreak="0">
-    <w:nsid w:val="756038B7"/>
+  <w:abstractNum w:abstractNumId="3" w15:restartNumberingAfterBreak="0">
+    <w:nsid w:val="525602F9"/>
     <w:multiLevelType w:val="hybridMultilevel"/>
-    <w:tmpl w:val="F9BC4438"/>
-    <w:lvl w:ilvl="0" w:tplc="968E59DA">
+    <w:tmpl w:val="843C6EC8"/>
+    <w:lvl w:ilvl="0" w:tplc="6DE8FB12">
       <w:start w:val="1"/>
       <w:numFmt w:val="decimal"/>
       <w:lvlText w:val="%1."/>
@@ -28802,73 +28751,127 @@
         <w:ind w:left="567" w:hanging="340"/>
       </w:pPr>
     </w:lvl>
-    <w:lvl w:ilvl="1" w:tplc="87707C2A">
+    <w:lvl w:ilvl="1" w:tplc="7A4E8D78">
       <w:numFmt w:val="decimal"/>
       <w:lvlText w:val=""/>
       <w:lvlJc w:val="left"/>
     </w:lvl>
-    <w:lvl w:ilvl="2" w:tplc="E1F03810">
+    <w:lvl w:ilvl="2" w:tplc="D2ACA99A">
       <w:numFmt w:val="decimal"/>
       <w:lvlText w:val=""/>
       <w:lvlJc w:val="left"/>
     </w:lvl>
-    <w:lvl w:ilvl="3" w:tplc="062C25D8">
+    <w:lvl w:ilvl="3" w:tplc="21422C7A">
       <w:numFmt w:val="decimal"/>
       <w:lvlText w:val=""/>
       <w:lvlJc w:val="left"/>
     </w:lvl>
-    <w:lvl w:ilvl="4" w:tplc="2DA68D6C">
+    <w:lvl w:ilvl="4" w:tplc="C1D49EC6">
       <w:numFmt w:val="decimal"/>
       <w:lvlText w:val=""/>
       <w:lvlJc w:val="left"/>
     </w:lvl>
-    <w:lvl w:ilvl="5" w:tplc="E506AD12">
+    <w:lvl w:ilvl="5" w:tplc="8A1E19D0">
       <w:numFmt w:val="decimal"/>
       <w:lvlText w:val=""/>
       <w:lvlJc w:val="left"/>
     </w:lvl>
-    <w:lvl w:ilvl="6" w:tplc="FD46F062">
+    <w:lvl w:ilvl="6" w:tplc="A02058D2">
       <w:numFmt w:val="decimal"/>
       <w:lvlText w:val=""/>
       <w:lvlJc w:val="left"/>
     </w:lvl>
-    <w:lvl w:ilvl="7" w:tplc="5EE87EFE">
+    <w:lvl w:ilvl="7" w:tplc="EAC2D8F2">
       <w:numFmt w:val="decimal"/>
       <w:lvlText w:val=""/>
       <w:lvlJc w:val="left"/>
     </w:lvl>
-    <w:lvl w:ilvl="8" w:tplc="7870008C">
+    <w:lvl w:ilvl="8" w:tplc="59988996">
       <w:numFmt w:val="decimal"/>
       <w:lvlText w:val=""/>
       <w:lvlJc w:val="left"/>
     </w:lvl>
   </w:abstractNum>
-  <w:num w:numId="1" w16cid:durableId="1159809155">
+  <w:abstractNum w:abstractNumId="4" w15:restartNumberingAfterBreak="0">
+    <w:nsid w:val="7C5C2788"/>
+    <w:multiLevelType w:val="hybridMultilevel"/>
+    <w:tmpl w:val="9A2E3E02"/>
+    <w:lvl w:ilvl="0" w:tplc="43B02C0A">
+      <w:start w:val="1"/>
+      <w:numFmt w:val="decimal"/>
+      <w:lvlText w:val="%1."/>
+      <w:lvlJc w:val="left"/>
+      <w:pPr>
+        <w:ind w:left="567" w:hanging="340"/>
+      </w:pPr>
+    </w:lvl>
+    <w:lvl w:ilvl="1" w:tplc="EEDC2568">
+      <w:numFmt w:val="decimal"/>
+      <w:lvlText w:val=""/>
+      <w:lvlJc w:val="left"/>
+    </w:lvl>
+    <w:lvl w:ilvl="2" w:tplc="64629142">
+      <w:numFmt w:val="decimal"/>
+      <w:lvlText w:val=""/>
+      <w:lvlJc w:val="left"/>
+    </w:lvl>
+    <w:lvl w:ilvl="3" w:tplc="3AFC50C4">
+      <w:numFmt w:val="decimal"/>
+      <w:lvlText w:val=""/>
+      <w:lvlJc w:val="left"/>
+    </w:lvl>
+    <w:lvl w:ilvl="4" w:tplc="C72C59F0">
+      <w:numFmt w:val="decimal"/>
+      <w:lvlText w:val=""/>
+      <w:lvlJc w:val="left"/>
+    </w:lvl>
+    <w:lvl w:ilvl="5" w:tplc="CC428972">
+      <w:numFmt w:val="decimal"/>
+      <w:lvlText w:val=""/>
+      <w:lvlJc w:val="left"/>
+    </w:lvl>
+    <w:lvl w:ilvl="6" w:tplc="4B1CD348">
+      <w:numFmt w:val="decimal"/>
+      <w:lvlText w:val=""/>
+      <w:lvlJc w:val="left"/>
+    </w:lvl>
+    <w:lvl w:ilvl="7" w:tplc="0018DEC2">
+      <w:numFmt w:val="decimal"/>
+      <w:lvlText w:val=""/>
+      <w:lvlJc w:val="left"/>
+    </w:lvl>
+    <w:lvl w:ilvl="8" w:tplc="4B86A5E6">
+      <w:numFmt w:val="decimal"/>
+      <w:lvlText w:val=""/>
+      <w:lvlJc w:val="left"/>
+    </w:lvl>
+  </w:abstractNum>
+  <w:num w:numId="1" w16cid:durableId="1341658151">
+    <w:abstractNumId w:val="1"/>
+    <w:lvlOverride w:ilvl="0">
+      <w:startOverride w:val="1"/>
+    </w:lvlOverride>
+  </w:num>
+  <w:num w:numId="2" w16cid:durableId="2058620393">
+    <w:abstractNumId w:val="0"/>
+    <w:lvlOverride w:ilvl="0">
+      <w:startOverride w:val="1"/>
+    </w:lvlOverride>
+  </w:num>
+  <w:num w:numId="3" w16cid:durableId="835804013">
+    <w:abstractNumId w:val="3"/>
+    <w:lvlOverride w:ilvl="0">
+      <w:startOverride w:val="1"/>
+    </w:lvlOverride>
+  </w:num>
+  <w:num w:numId="4" w16cid:durableId="933704912">
     <w:abstractNumId w:val="2"/>
     <w:lvlOverride w:ilvl="0">
       <w:startOverride w:val="1"/>
     </w:lvlOverride>
   </w:num>
-  <w:num w:numId="2" w16cid:durableId="1038432827">
-    <w:abstractNumId w:val="0"/>
-    <w:lvlOverride w:ilvl="0">
-      <w:startOverride w:val="1"/>
-    </w:lvlOverride>
-  </w:num>
-  <w:num w:numId="3" w16cid:durableId="1403915475">
-    <w:abstractNumId w:val="3"/>
-    <w:lvlOverride w:ilvl="0">
-      <w:startOverride w:val="1"/>
-    </w:lvlOverride>
-  </w:num>
-  <w:num w:numId="4" w16cid:durableId="993992463">
+  <w:num w:numId="5" w16cid:durableId="372118898">
     <w:abstractNumId w:val="4"/>
-    <w:lvlOverride w:ilvl="0">
-      <w:startOverride w:val="1"/>
-    </w:lvlOverride>
-  </w:num>
-  <w:num w:numId="5" w16cid:durableId="946691899">
-    <w:abstractNumId w:val="1"/>
     <w:lvlOverride w:ilvl="0">
       <w:startOverride w:val="1"/>
     </w:lvlOverride>

</xml_diff>